<commit_message>
Methodology update in doc
</commit_message>
<xml_diff>
--- a/Model/Thesis Adam Foster.docx
+++ b/Model/Thesis Adam Foster.docx
@@ -2146,10 +2146,7 @@
         <w:t>IRF forecasts of output are one of the</w:t>
       </w:r>
       <w:r>
-        <w:t xml:space="preserve"> results of running the RBC model. These are compared to the realised equivalent variable, which is </w:t>
-      </w:r>
-      <w:r>
-        <w:t xml:space="preserve">quarterly seasonally adjusted </w:t>
+        <w:t xml:space="preserve"> results of running the RBC model. These are compared to the realised equivalent variable, which is quarterly seasonally adjusted </w:t>
       </w:r>
       <w:r>
         <w:rPr>
@@ -2278,13 +2275,22 @@
         <w:t xml:space="preserve">, respectively. </w:t>
       </w:r>
       <w:r>
-        <w:t xml:space="preserve">The limiting factor is GDPC1 which is limited to dates after 1989-12-29 in the API, which still ensures a plethora of observations to test multiple strategy variations. </w:t>
-      </w:r>
-      <w:r>
-        <w:t>All data is pulled once ahead of running any model and is instantiated using an independent data class that spans the maximum possible training and test periods.</w:t>
-      </w:r>
-      <w:r>
-        <w:t xml:space="preserve"> This prevents spillover between data and its handling, plus avoids having to make multiple slow connections to retrieve data.</w:t>
+        <w:t xml:space="preserve">The limiting factor </w:t>
+      </w:r>
+      <w:r>
+        <w:t xml:space="preserve">in terms of time horizons of the data </w:t>
+      </w:r>
+      <w:r>
+        <w:t xml:space="preserve">is GDPC1 which is limited to dates after 1989-12-29 in the API, which still ensures a plethora of observations to test multiple strategy variations. </w:t>
+      </w:r>
+      <w:r>
+        <w:t>All data is pulled once ahead of running any model and is instantiated using an independent data class that spans the maximum possible training and test periods. This prevents spillover between data and its handling, plus avoids having to make multiple slow connections to retrieve data</w:t>
+      </w:r>
+      <w:r>
+        <w:t xml:space="preserve"> that could be subject to throttling</w:t>
+      </w:r>
+      <w:r>
+        <w:t>.</w:t>
       </w:r>
     </w:p>
     <w:p>
@@ -2352,6 +2358,14 @@
         <w:t>4. Methodology</w:t>
       </w:r>
       <w:bookmarkEnd w:id="5"/>
+    </w:p>
+    <w:p>
+      <w:pPr>
+        <w:pStyle w:val="Heading2"/>
+      </w:pPr>
+      <w:r>
+        <w:t>RBC Model</w:t>
+      </w:r>
     </w:p>
     <w:p>
       <w:pPr>
@@ -2554,24 +2568,14 @@
       <w:r>
         <w:t xml:space="preserve">Equation </w:t>
       </w:r>
-      <w:r>
-        <w:fldChar w:fldCharType="begin"/>
-      </w:r>
-      <w:r>
-        <w:instrText xml:space="preserve"> SEQ Equation \* ARABIC </w:instrText>
-      </w:r>
-      <w:r>
-        <w:fldChar w:fldCharType="separate"/>
-      </w:r>
-      <w:r>
-        <w:rPr>
-          <w:noProof/>
-        </w:rPr>
-        <w:t>1</w:t>
-      </w:r>
-      <w:r>
-        <w:fldChar w:fldCharType="end"/>
-      </w:r>
+      <w:fldSimple w:instr=" SEQ Equation \* ARABIC ">
+        <w:r>
+          <w:rPr>
+            <w:noProof/>
+          </w:rPr>
+          <w:t>1</w:t>
+        </w:r>
+      </w:fldSimple>
       <w:bookmarkEnd w:id="6"/>
       <w:r>
         <w:t>: Household objective</w:t>
@@ -2985,24 +2989,14 @@
       <w:r>
         <w:t xml:space="preserve">Equation </w:t>
       </w:r>
-      <w:r>
-        <w:fldChar w:fldCharType="begin"/>
-      </w:r>
-      <w:r>
-        <w:instrText xml:space="preserve"> SEQ Equation \* ARABIC </w:instrText>
-      </w:r>
-      <w:r>
-        <w:fldChar w:fldCharType="separate"/>
-      </w:r>
-      <w:r>
-        <w:rPr>
-          <w:noProof/>
-        </w:rPr>
-        <w:t>2</w:t>
-      </w:r>
-      <w:r>
-        <w:fldChar w:fldCharType="end"/>
-      </w:r>
+      <w:fldSimple w:instr=" SEQ Equation \* ARABIC ">
+        <w:r>
+          <w:rPr>
+            <w:noProof/>
+          </w:rPr>
+          <w:t>2</w:t>
+        </w:r>
+      </w:fldSimple>
       <w:bookmarkEnd w:id="7"/>
       <w:r>
         <w:t>: Firm objective</w:t>
@@ -3319,14 +3313,7 @@
                       <w:rFonts w:ascii="Cambria Math" w:hAnsi="Cambria Math"/>
                       <w:sz w:val="24"/>
                     </w:rPr>
-                    <m:t>t</m:t>
-                  </m:r>
-                  <m:r>
-                    <w:rPr>
-                      <w:rFonts w:ascii="Cambria Math" w:hAnsi="Cambria Math"/>
-                      <w:sz w:val="24"/>
-                    </w:rPr>
-                    <m:t>-1</m:t>
+                    <m:t>t-1</m:t>
                   </m:r>
                 </m:sub>
               </m:sSub>
@@ -3505,24 +3492,14 @@
       <w:r>
         <w:t xml:space="preserve">Equation </w:t>
       </w:r>
-      <w:r>
-        <w:fldChar w:fldCharType="begin"/>
-      </w:r>
-      <w:r>
-        <w:instrText xml:space="preserve"> SEQ Equation \* ARABIC </w:instrText>
-      </w:r>
-      <w:r>
-        <w:fldChar w:fldCharType="separate"/>
-      </w:r>
-      <w:r>
-        <w:rPr>
-          <w:noProof/>
-        </w:rPr>
-        <w:t>3</w:t>
-      </w:r>
-      <w:r>
-        <w:fldChar w:fldCharType="end"/>
-      </w:r>
+      <w:fldSimple w:instr=" SEQ Equation \* ARABIC ">
+        <w:r>
+          <w:rPr>
+            <w:noProof/>
+          </w:rPr>
+          <w:t>3</w:t>
+        </w:r>
+      </w:fldSimple>
       <w:bookmarkEnd w:id="8"/>
       <w:r>
         <w:t>: Budget constraint</w:t>
@@ -3652,24 +3629,14 @@
       <w:r>
         <w:t xml:space="preserve">Equation </w:t>
       </w:r>
-      <w:r>
-        <w:fldChar w:fldCharType="begin"/>
-      </w:r>
-      <w:r>
-        <w:instrText xml:space="preserve"> SEQ Equation \* ARABIC </w:instrText>
-      </w:r>
-      <w:r>
-        <w:fldChar w:fldCharType="separate"/>
-      </w:r>
-      <w:r>
-        <w:rPr>
-          <w:noProof/>
-        </w:rPr>
-        <w:t>4</w:t>
-      </w:r>
-      <w:r>
-        <w:fldChar w:fldCharType="end"/>
-      </w:r>
+      <w:fldSimple w:instr=" SEQ Equation \* ARABIC ">
+        <w:r>
+          <w:rPr>
+            <w:noProof/>
+          </w:rPr>
+          <w:t>4</w:t>
+        </w:r>
+      </w:fldSimple>
       <w:bookmarkEnd w:id="9"/>
       <w:r>
         <w:t>: Production function</w:t>
@@ -3840,14 +3807,7 @@
                   <w:rFonts w:ascii="Cambria Math" w:hAnsi="Cambria Math"/>
                   <w:sz w:val="24"/>
                 </w:rPr>
-                <m:t>1-</m:t>
-              </m:r>
-              <m:r>
-                <w:rPr>
-                  <w:rFonts w:ascii="Cambria Math" w:hAnsi="Cambria Math"/>
-                  <w:sz w:val="24"/>
-                </w:rPr>
-                <m:t>α</m:t>
+                <m:t>1-α</m:t>
               </m:r>
             </m:sup>
           </m:sSubSup>
@@ -3864,24 +3824,14 @@
       <w:r>
         <w:t xml:space="preserve">Equation </w:t>
       </w:r>
-      <w:r>
-        <w:fldChar w:fldCharType="begin"/>
-      </w:r>
-      <w:r>
-        <w:instrText xml:space="preserve"> SEQ Equation \* ARABIC </w:instrText>
-      </w:r>
-      <w:r>
-        <w:fldChar w:fldCharType="separate"/>
-      </w:r>
-      <w:r>
-        <w:rPr>
-          <w:noProof/>
-        </w:rPr>
-        <w:t>5</w:t>
-      </w:r>
-      <w:r>
-        <w:fldChar w:fldCharType="end"/>
-      </w:r>
+      <w:fldSimple w:instr=" SEQ Equation \* ARABIC ">
+        <w:r>
+          <w:rPr>
+            <w:noProof/>
+          </w:rPr>
+          <w:t>5</w:t>
+        </w:r>
+      </w:fldSimple>
       <w:bookmarkEnd w:id="10"/>
       <w:r>
         <w:t>: Capital accumulation constraint</w:t>
@@ -3918,14 +3868,7 @@
                   <w:rFonts w:ascii="Cambria Math" w:hAnsi="Cambria Math"/>
                   <w:sz w:val="24"/>
                 </w:rPr>
-                <m:t>t</m:t>
-              </m:r>
-              <m:r>
-                <w:rPr>
-                  <w:rFonts w:ascii="Cambria Math" w:hAnsi="Cambria Math"/>
-                  <w:sz w:val="24"/>
-                </w:rPr>
-                <m:t>+1</m:t>
+                <m:t>t+1</m:t>
               </m:r>
             </m:sub>
           </m:sSub>
@@ -4031,31 +3974,23 @@
         <w:jc w:val="both"/>
       </w:pPr>
       <w:bookmarkStart w:id="11" w:name="_Ref229938397"/>
+      <w:bookmarkStart w:id="12" w:name="_Ref230475440"/>
       <w:r>
         <w:t xml:space="preserve">Equation </w:t>
       </w:r>
-      <w:r>
-        <w:fldChar w:fldCharType="begin"/>
-      </w:r>
-      <w:r>
-        <w:instrText xml:space="preserve"> SEQ Equation \* ARABIC </w:instrText>
-      </w:r>
-      <w:r>
-        <w:fldChar w:fldCharType="separate"/>
-      </w:r>
-      <w:r>
-        <w:rPr>
-          <w:noProof/>
-        </w:rPr>
-        <w:t>6</w:t>
-      </w:r>
-      <w:r>
-        <w:fldChar w:fldCharType="end"/>
-      </w:r>
+      <w:fldSimple w:instr=" SEQ Equation \* ARABIC ">
+        <w:r>
+          <w:rPr>
+            <w:noProof/>
+          </w:rPr>
+          <w:t>6</w:t>
+        </w:r>
+      </w:fldSimple>
       <w:bookmarkEnd w:id="11"/>
       <w:r>
         <w:t>: Exogenous TFP shock process</w:t>
       </w:r>
+      <w:bookmarkEnd w:id="12"/>
     </w:p>
     <w:p>
       <w:pPr>
@@ -4088,14 +4023,7 @@
                   <w:rFonts w:ascii="Cambria Math" w:hAnsi="Cambria Math"/>
                   <w:sz w:val="24"/>
                 </w:rPr>
-                <m:t>t</m:t>
-              </m:r>
-              <m:r>
-                <w:rPr>
-                  <w:rFonts w:ascii="Cambria Math" w:hAnsi="Cambria Math"/>
-                  <w:sz w:val="24"/>
-                </w:rPr>
-                <m:t>+1</m:t>
+                <m:t>t+1</m:t>
               </m:r>
             </m:sub>
           </m:sSub>
@@ -4167,21 +4095,7 @@
                   <w:rFonts w:ascii="Cambria Math" w:hAnsi="Cambria Math"/>
                   <w:sz w:val="24"/>
                 </w:rPr>
-                <m:t>z,</m:t>
-              </m:r>
-              <m:r>
-                <w:rPr>
-                  <w:rFonts w:ascii="Cambria Math" w:hAnsi="Cambria Math"/>
-                  <w:sz w:val="24"/>
-                </w:rPr>
-                <m:t>t</m:t>
-              </m:r>
-              <m:r>
-                <w:rPr>
-                  <w:rFonts w:ascii="Cambria Math" w:hAnsi="Cambria Math"/>
-                  <w:sz w:val="24"/>
-                </w:rPr>
-                <m:t>+1</m:t>
+                <m:t>z,t+1</m:t>
               </m:r>
             </m:sub>
           </m:sSub>
@@ -4204,10 +4118,7 @@
         </m:r>
       </m:oMath>
       <w:r>
-        <w:t xml:space="preserve"> is investment</w:t>
-      </w:r>
-      <w:r>
-        <w:t xml:space="preserve">, </w:t>
+        <w:t xml:space="preserve"> is investment, </w:t>
       </w:r>
       <m:oMath>
         <m:r>
@@ -4218,10 +4129,7 @@
         </m:r>
       </m:oMath>
       <w:r>
-        <w:t xml:space="preserve"> is </w:t>
-      </w:r>
-      <w:r>
-        <w:t xml:space="preserve">TFP, </w:t>
+        <w:t xml:space="preserve"> is TFP, </w:t>
       </w:r>
       <m:oMath>
         <m:r>
@@ -4232,10 +4140,7 @@
         </m:r>
       </m:oMath>
       <w:r>
-        <w:t xml:space="preserve"> is </w:t>
-      </w:r>
-      <w:r>
-        <w:t xml:space="preserve">elasticity of capital, </w:t>
+        <w:t xml:space="preserve"> is elasticity of capital, </w:t>
       </w:r>
       <m:oMath>
         <m:r>
@@ -4246,10 +4151,7 @@
         </m:r>
       </m:oMath>
       <w:r>
-        <w:t xml:space="preserve"> is </w:t>
-      </w:r>
-      <w:r>
-        <w:t xml:space="preserve">depreciation of capital, </w:t>
+        <w:t xml:space="preserve"> is depreciation of capital, </w:t>
       </w:r>
       <m:oMath>
         <m:r>
@@ -4260,16 +4162,7 @@
         </m:r>
       </m:oMath>
       <w:r>
-        <w:t xml:space="preserve"> is </w:t>
-      </w:r>
-      <w:r>
-        <w:t xml:space="preserve">persistence </w:t>
-      </w:r>
-      <w:r>
-        <w:t xml:space="preserve">of </w:t>
-      </w:r>
-      <w:r>
-        <w:t>the TFP shock.</w:t>
+        <w:t xml:space="preserve"> is persistence of the TFP shock.</w:t>
       </w:r>
     </w:p>
     <w:p>
@@ -4302,11 +4195,393 @@
       <w:pPr>
         <w:jc w:val="both"/>
       </w:pPr>
-    </w:p>
-    <w:p>
-      <w:pPr>
-        <w:jc w:val="both"/>
-      </w:pPr>
+      <w:r>
+        <w:lastRenderedPageBreak/>
+        <w:t>For the framework to retain trading applicability, time series data entering the model remains sequential and is used for next-period forecasting.</w:t>
+      </w:r>
+      <w:r>
+        <w:t xml:space="preserve"> Iterating this approach </w:t>
+      </w:r>
+      <w:r>
+        <w:t>along a moving window</w:t>
+      </w:r>
+      <w:r>
+        <w:t xml:space="preserve"> continually fine-tunes the model and applies the latest shock magnitude. This also enables strategy </w:t>
+      </w:r>
+      <w:proofErr w:type="spellStart"/>
+      <w:r>
+        <w:t>backtesting</w:t>
+      </w:r>
+      <w:proofErr w:type="spellEnd"/>
+      <w:r>
+        <w:t>.</w:t>
+      </w:r>
+    </w:p>
+    <w:p>
+      <w:pPr>
+        <w:jc w:val="both"/>
+      </w:pPr>
+      <w:r>
+        <w:t xml:space="preserve">Various training lengths are employed, whereby </w:t>
+      </w:r>
+      <w:r>
+        <w:t>OPHNFB</w:t>
+      </w:r>
+      <w:r>
+        <w:t xml:space="preserve"> </w:t>
+      </w:r>
+      <w:r>
+        <w:t>productivity data is sliced in preparation for the model. This data is converted to natural logarithm</w:t>
+      </w:r>
+      <w:r>
+        <w:t xml:space="preserve"> form for percentage deviations</w:t>
+      </w:r>
+      <w:r>
+        <w:t xml:space="preserve"> and undergoes HP filtering assuming a lambda value of 1600 for quarterly data to extract the cyclical component of the time serie</w:t>
+      </w:r>
+      <w:r>
+        <w:t>s</w:t>
+      </w:r>
+      <w:r>
+        <w:t>.</w:t>
+      </w:r>
+    </w:p>
+    <w:p>
+      <w:pPr>
+        <w:jc w:val="both"/>
+      </w:pPr>
+      <w:r>
+        <w:t xml:space="preserve">The modified time series </w:t>
+      </w:r>
+      <m:oMath>
+        <m:sSub>
+          <m:sSubPr>
+            <m:ctrlPr>
+              <w:rPr>
+                <w:rFonts w:ascii="Cambria Math" w:hAnsi="Cambria Math"/>
+                <w:i/>
+                <w:sz w:val="24"/>
+              </w:rPr>
+            </m:ctrlPr>
+          </m:sSubPr>
+          <m:e>
+            <m:r>
+              <w:rPr>
+                <w:rFonts w:ascii="Cambria Math" w:hAnsi="Cambria Math"/>
+                <w:sz w:val="24"/>
+              </w:rPr>
+              <m:t>z</m:t>
+            </m:r>
+          </m:e>
+          <m:sub>
+            <m:r>
+              <w:rPr>
+                <w:rFonts w:ascii="Cambria Math" w:hAnsi="Cambria Math"/>
+                <w:sz w:val="24"/>
+              </w:rPr>
+              <m:t>t</m:t>
+            </m:r>
+          </m:sub>
+        </m:sSub>
+      </m:oMath>
+      <w:r>
+        <w:rPr>
+          <w:rFonts w:eastAsiaTheme="minorEastAsia"/>
+          <w:sz w:val="24"/>
+        </w:rPr>
+        <w:t xml:space="preserve"> </w:t>
+      </w:r>
+      <w:r>
+        <w:t xml:space="preserve">is regressed against its lagged values as per the AR1 process in </w:t>
+      </w:r>
+      <w:r>
+        <w:fldChar w:fldCharType="begin"/>
+      </w:r>
+      <w:r>
+        <w:instrText xml:space="preserve"> REF _Ref230475440 \h </w:instrText>
+      </w:r>
+      <w:r>
+        <w:fldChar w:fldCharType="separate"/>
+      </w:r>
+      <w:r>
+        <w:t xml:space="preserve">Equation </w:t>
+      </w:r>
+      <w:r>
+        <w:rPr>
+          <w:noProof/>
+        </w:rPr>
+        <w:t>6</w:t>
+      </w:r>
+      <w:r>
+        <w:t>: Exogenous TFP shock process</w:t>
+      </w:r>
+      <w:r>
+        <w:fldChar w:fldCharType="end"/>
+      </w:r>
+      <w:r>
+        <w:t xml:space="preserve"> using the OLS estimator</w:t>
+      </w:r>
+      <w:r>
+        <w:t>.</w:t>
+      </w:r>
+      <w:r>
+        <w:t xml:space="preserve"> The resulting coefficient is set as the calibrated TFP persistence parameter </w:t>
+      </w:r>
+      <m:oMath>
+        <m:r>
+          <w:rPr>
+            <w:rFonts w:ascii="Cambria Math" w:hAnsi="Cambria Math"/>
+            <w:sz w:val="24"/>
+          </w:rPr>
+          <m:t>ρ</m:t>
+        </m:r>
+      </m:oMath>
+      <w:r>
+        <w:t xml:space="preserve"> in the model.</w:t>
+      </w:r>
+      <w:r>
+        <w:t xml:space="preserve"> For the model to be solved quickly and given the basic RBC model type with small shocks, a local perturbation solution </w:t>
+      </w:r>
+      <w:r>
+        <w:t xml:space="preserve">with </w:t>
+      </w:r>
+      <w:r>
+        <w:t xml:space="preserve">a first-order Taylor approximation of the policy functions are used. An IRF is then run, assuming the latest TFP shock value </w:t>
+      </w:r>
+      <m:oMath>
+        <m:sSub>
+          <m:sSubPr>
+            <m:ctrlPr>
+              <w:rPr>
+                <w:rFonts w:ascii="Cambria Math" w:hAnsi="Cambria Math"/>
+                <w:i/>
+                <w:sz w:val="24"/>
+              </w:rPr>
+            </m:ctrlPr>
+          </m:sSubPr>
+          <m:e>
+            <m:r>
+              <w:rPr>
+                <w:rFonts w:ascii="Cambria Math" w:hAnsi="Cambria Math"/>
+                <w:sz w:val="24"/>
+              </w:rPr>
+              <m:t>e</m:t>
+            </m:r>
+          </m:e>
+          <m:sub>
+            <m:r>
+              <w:rPr>
+                <w:rFonts w:ascii="Cambria Math" w:hAnsi="Cambria Math"/>
+                <w:sz w:val="24"/>
+              </w:rPr>
+              <m:t>z,t</m:t>
+            </m:r>
+          </m:sub>
+        </m:sSub>
+      </m:oMath>
+      <w:r>
+        <w:t xml:space="preserve"> from the residuals in the AR1 estimation.</w:t>
+      </w:r>
+    </w:p>
+    <w:p>
+      <w:pPr>
+        <w:jc w:val="both"/>
+      </w:pPr>
+      <w:r>
+        <w:t xml:space="preserve">The goal is to obtain the equivalent of </w:t>
+      </w:r>
+      <w:r>
+        <w:t xml:space="preserve">a </w:t>
+      </w:r>
+      <w:r>
+        <w:t xml:space="preserve">next-period GDP </w:t>
+      </w:r>
+      <w:r>
+        <w:t xml:space="preserve">change </w:t>
+      </w:r>
+      <w:r>
+        <w:t xml:space="preserve">forecast. </w:t>
+      </w:r>
+      <w:r>
+        <w:t>IRF forecast values are multiplicative deviations from the normalised steady state level of 1 and are therefore converted to percentage deviations.</w:t>
+      </w:r>
+      <w:r>
+        <w:t xml:space="preserve"> </w:t>
+      </w:r>
+      <w:r>
+        <w:t>The output IRF array is assumed to correspond to GDP.</w:t>
+      </w:r>
+      <w:r>
+        <w:t xml:space="preserve"> </w:t>
+      </w:r>
+      <w:r>
+        <w:t xml:space="preserve">The </w:t>
+      </w:r>
+      <w:r>
+        <w:t xml:space="preserve">response at the second horizon period </w:t>
+      </w:r>
+      <w:r>
+        <w:t xml:space="preserve">is recorded </w:t>
+      </w:r>
+      <w:r>
+        <w:t xml:space="preserve">as the output forecast for </w:t>
+      </w:r>
+      <w:r>
+        <w:t xml:space="preserve">this </w:t>
+      </w:r>
+      <w:r>
+        <w:t>run of the model</w:t>
+      </w:r>
+      <w:r>
+        <w:t xml:space="preserve">: the </w:t>
+      </w:r>
+      <w:r>
+        <w:t xml:space="preserve">initial response </w:t>
+      </w:r>
+      <w:r>
+        <w:t xml:space="preserve">corresponds to the impact period, the </w:t>
+      </w:r>
+      <w:r>
+        <w:t>response at the first horizon period reflects only the immediate labour and consumption reallocation, whilst the response at the second horizon period acknowledges capital adjustment</w:t>
+      </w:r>
+      <w:r>
+        <w:t xml:space="preserve"> and </w:t>
+      </w:r>
+      <w:r>
+        <w:t xml:space="preserve">reflects the intended </w:t>
+      </w:r>
+      <w:r>
+        <w:t xml:space="preserve">impact direction of </w:t>
+      </w:r>
+      <w:r>
+        <w:t>a productivity shock</w:t>
+      </w:r>
+      <w:r>
+        <w:t xml:space="preserve">. It also reflects </w:t>
+      </w:r>
+      <w:r>
+        <w:t>the timing of quarterly national accounts.</w:t>
+      </w:r>
+    </w:p>
+    <w:p>
+      <w:pPr>
+        <w:jc w:val="both"/>
+      </w:pPr>
+      <w:r>
+        <w:t>The process is repeated for data windows shifted quarterly within an overall horizon</w:t>
+      </w:r>
+      <w:r>
+        <w:t xml:space="preserve"> of the strategy </w:t>
+      </w:r>
+      <w:proofErr w:type="spellStart"/>
+      <w:r>
+        <w:t>backtest</w:t>
+      </w:r>
+      <w:proofErr w:type="spellEnd"/>
+      <w:r>
+        <w:t>. The result is a time series of next-period output forecasts.</w:t>
+      </w:r>
+    </w:p>
+    <w:p>
+      <w:pPr>
+        <w:jc w:val="both"/>
+      </w:pPr>
+      <w:r>
+        <w:t>Insert shock value examples</w:t>
+      </w:r>
+    </w:p>
+    <w:p>
+      <w:pPr>
+        <w:jc w:val="both"/>
+      </w:pPr>
+      <w:r>
+        <w:t>Insert IRF example</w:t>
+      </w:r>
+    </w:p>
+    <w:p>
+      <w:pPr>
+        <w:pStyle w:val="Heading2"/>
+      </w:pPr>
+      <w:r>
+        <w:t>Realised GDP</w:t>
+      </w:r>
+    </w:p>
+    <w:p>
+      <w:pPr>
+        <w:jc w:val="both"/>
+      </w:pPr>
+      <w:r>
+        <w:t xml:space="preserve">Realised values of GDP are needed in addition to output forecasts for subsequent signal generation. </w:t>
+      </w:r>
+      <w:r>
+        <w:t xml:space="preserve">GDPC1 data </w:t>
+      </w:r>
+      <w:r>
+        <w:t xml:space="preserve">undergoes HP filtering </w:t>
+      </w:r>
+      <w:r>
+        <w:t xml:space="preserve">on natural logarithms to ensure a like-for-like comparison with output forecasts. It is therefore initially </w:t>
+      </w:r>
+      <w:r>
+        <w:t>sliced similarly to</w:t>
+      </w:r>
+      <w:r>
+        <w:t xml:space="preserve"> </w:t>
+      </w:r>
+      <w:r>
+        <w:t>OPHNFB</w:t>
+      </w:r>
+      <w:r>
+        <w:t xml:space="preserve"> data</w:t>
+      </w:r>
+      <w:r>
+        <w:t xml:space="preserve">, aligning data lengths but setting the end date one quarter later than </w:t>
+      </w:r>
+      <w:r>
+        <w:t>OPHNFB</w:t>
+      </w:r>
+      <w:r>
+        <w:t xml:space="preserve"> at the date for which the next-period forecast is been made.</w:t>
+      </w:r>
+    </w:p>
+    <w:p>
+      <w:pPr>
+        <w:pStyle w:val="Heading2"/>
+      </w:pPr>
+      <w:r>
+        <w:t>Signal Generation</w:t>
+      </w:r>
+    </w:p>
+    <w:p>
+      <w:pPr>
+        <w:jc w:val="both"/>
+      </w:pPr>
+    </w:p>
+    <w:p>
+      <w:pPr>
+        <w:jc w:val="both"/>
+      </w:pPr>
+    </w:p>
+    <w:p>
+      <w:pPr>
+        <w:jc w:val="both"/>
+      </w:pPr>
+    </w:p>
+    <w:p>
+      <w:pPr>
+        <w:jc w:val="both"/>
+      </w:pPr>
+      <w:r>
+        <w:t>Insert flowchart depicting signal generation process</w:t>
+      </w:r>
+    </w:p>
+    <w:p>
+      <w:pPr>
+        <w:jc w:val="both"/>
+      </w:pPr>
+      <w:r>
+        <w:t>Insert hyperparameters/run combinations</w:t>
+      </w:r>
     </w:p>
     <w:p>
       <w:pPr>
@@ -4331,12 +4606,12 @@
         <w:pStyle w:val="Heading1"/>
         <w:jc w:val="both"/>
       </w:pPr>
-      <w:bookmarkStart w:id="12" w:name="_Toc229918254"/>
+      <w:bookmarkStart w:id="13" w:name="_Toc229918254"/>
       <w:r>
         <w:lastRenderedPageBreak/>
         <w:t>5. Results</w:t>
       </w:r>
-      <w:bookmarkEnd w:id="12"/>
+      <w:bookmarkEnd w:id="13"/>
     </w:p>
     <w:p>
       <w:pPr>
@@ -4372,12 +4647,12 @@
         <w:pStyle w:val="Heading1"/>
         <w:jc w:val="both"/>
       </w:pPr>
-      <w:bookmarkStart w:id="13" w:name="_Toc229918255"/>
+      <w:bookmarkStart w:id="14" w:name="_Toc229918255"/>
       <w:r>
         <w:lastRenderedPageBreak/>
         <w:t>6. Limitations and Improvements</w:t>
       </w:r>
-      <w:bookmarkEnd w:id="13"/>
+      <w:bookmarkEnd w:id="14"/>
     </w:p>
     <w:p>
       <w:pPr>
@@ -4413,12 +4688,12 @@
         <w:pStyle w:val="Heading1"/>
         <w:jc w:val="both"/>
       </w:pPr>
-      <w:bookmarkStart w:id="14" w:name="_Toc229918256"/>
+      <w:bookmarkStart w:id="15" w:name="_Toc229918256"/>
       <w:r>
         <w:lastRenderedPageBreak/>
         <w:t>7. Conclusion</w:t>
       </w:r>
-      <w:bookmarkEnd w:id="14"/>
+      <w:bookmarkEnd w:id="15"/>
     </w:p>
     <w:p>
       <w:pPr>
@@ -4449,7 +4724,7 @@
         <w:br w:type="page"/>
       </w:r>
     </w:p>
-    <w:bookmarkStart w:id="15" w:name="_Toc229918257" w:displacedByCustomXml="next"/>
+    <w:bookmarkStart w:id="16" w:name="_Toc229918257" w:displacedByCustomXml="next"/>
     <w:sdt>
       <w:sdtPr>
         <w:rPr>
@@ -4472,7 +4747,7 @@
           <w:r>
             <w:t>Bibliography</w:t>
           </w:r>
-          <w:bookmarkEnd w:id="15"/>
+          <w:bookmarkEnd w:id="16"/>
         </w:p>
         <w:sdt>
           <w:sdtPr>
@@ -4993,18 +5268,18 @@
         <w:pStyle w:val="Heading1"/>
         <w:jc w:val="both"/>
       </w:pPr>
-      <w:bookmarkStart w:id="16" w:name="_Toc229918258"/>
+      <w:bookmarkStart w:id="17" w:name="_Toc229918258"/>
       <w:r>
         <w:lastRenderedPageBreak/>
         <w:t>Appendices</w:t>
       </w:r>
-      <w:bookmarkEnd w:id="16"/>
+      <w:bookmarkEnd w:id="17"/>
     </w:p>
     <w:p>
       <w:pPr>
         <w:pStyle w:val="Heading2"/>
       </w:pPr>
-      <w:bookmarkStart w:id="17" w:name="_Ref229936642"/>
+      <w:bookmarkStart w:id="18" w:name="_Ref229936642"/>
       <w:r>
         <w:t xml:space="preserve">Appendix </w:t>
       </w:r>
@@ -5014,7 +5289,7 @@
       <w:r>
         <w:t>: Basic RBC Model YAML code</w:t>
       </w:r>
-      <w:bookmarkEnd w:id="17"/>
+      <w:bookmarkEnd w:id="18"/>
     </w:p>
     <w:p>
       <w:pPr>
@@ -5032,44 +5307,24 @@
     <w:p>
       <w:pPr>
         <w:jc w:val="both"/>
-        <w:rPr>
-          <w:lang w:val="pl-PL"/>
-        </w:rPr>
-      </w:pPr>
-      <w:proofErr w:type="spellStart"/>
-      <w:r>
-        <w:rPr>
-          <w:lang w:val="pl-PL"/>
-        </w:rPr>
-        <w:t>symbols</w:t>
-      </w:r>
-      <w:proofErr w:type="spellEnd"/>
-      <w:r>
-        <w:rPr>
-          <w:lang w:val="pl-PL"/>
-        </w:rPr>
-        <w:t>:</w:t>
-      </w:r>
-    </w:p>
-    <w:p>
-      <w:pPr>
-        <w:jc w:val="both"/>
-        <w:rPr>
-          <w:lang w:val="pl-PL"/>
-        </w:rPr>
-      </w:pPr>
-    </w:p>
-    <w:p>
-      <w:pPr>
-        <w:jc w:val="both"/>
-        <w:rPr>
-          <w:lang w:val="pl-PL"/>
-        </w:rPr>
-      </w:pPr>
-      <w:r>
-        <w:rPr>
-          <w:lang w:val="pl-PL"/>
-        </w:rPr>
+      </w:pPr>
+      <w:r>
+        <w:t>symbols:</w:t>
+      </w:r>
+    </w:p>
+    <w:p>
+      <w:pPr>
+        <w:jc w:val="both"/>
+      </w:pPr>
+    </w:p>
+    <w:p>
+      <w:pPr>
+        <w:jc w:val="both"/>
+        <w:rPr>
+          <w:lang w:val="pl-PL"/>
+        </w:rPr>
+      </w:pPr>
+      <w:r>
         <w:t xml:space="preserve">   </w:t>
       </w:r>
       <w:proofErr w:type="spellStart"/>
@@ -6841,6 +7096,7 @@
   <w:style w:type="character" w:default="1" w:styleId="DefaultParagraphFont">
     <w:name w:val="Default Paragraph Font"/>
     <w:uiPriority w:val="1"/>
+    <w:semiHidden/>
     <w:unhideWhenUsed/>
   </w:style>
   <w:style w:type="table" w:default="1" w:styleId="TableNormal">

</xml_diff>